<commit_message>
feat(game-maker): play, write, review: with answer cards on every question shows a yellow Line number for the paper answer sheet, and the end screen has What we found hard (hardest lines first, tap to show, practise them); printable game answer sheet; 3B Wednesday plan uses it
Co-Authored-By: Claude Opus 5.5 <noreply@anthropic.com>
</commit_message>
<xml_diff>
--- a/lesson-plans/Grade3B-Units1-4-Revision-Games-Lesson-Plan.docx
+++ b/lesson-plans/Grade3B-Units1-4-Revision-Games-Lesson-Plan.docx
@@ -48,7 +48,7 @@
         <w:t xml:space="preserve">Prepare. </w:t>
       </w:r>
       <w:r>
-        <w:t xml:space="preserve">Game Maker: set Units 1–4 (Grade 3), Monsters = 3B, Answer cards = On, ordinary cartoon skin (no Halloween). Answer cards A/B/C/D, or mini whiteboards. The Class Plan light stays on from the quiz lesson.</w:t>
+        <w:t xml:space="preserve">Game Maker: set Units 1–4 (Grade 3), Monsters = 3B, Answer cards = On, ordinary cartoon skin (no Halloween). The game answer sheet (2 per A4), one per pupil. The Class Plan light stays on from the quiz lesson.</w:t>
       </w:r>
     </w:p>
     <w:p>
@@ -275,7 +275,7 @@
                 <w:sz w:val="18"/>
                 <w:szCs w:val="18"/>
               </w:rPr>
-              <w:t xml:space="preserve">Rules</w:t>
+              <w:t xml:space="preserve">Rules + sheets</w:t>
             </w:r>
           </w:p>
         </w:tc>
@@ -300,7 +300,7 @@
                 <w:sz w:val="18"/>
                 <w:szCs w:val="18"/>
               </w:rPr>
-              <w:t xml:space="preserve">Daily 3-minute reset: the 3 rules and one bell game.</w:t>
+              <w:t xml:space="preserve">Bell game once. Give every pupil the game answer sheet (game-maker/Game-Answer-Sheet.pdf). Name and class on top.</w:t>
             </w:r>
           </w:p>
         </w:tc>
@@ -325,7 +325,7 @@
                 <w:sz w:val="18"/>
                 <w:szCs w:val="18"/>
               </w:rPr>
-              <w:t xml:space="preserve">Freeze on the bell.</w:t>
+              <w:t xml:space="preserve">Write name; pencil ready.</w:t>
             </w:r>
           </w:p>
         </w:tc>
@@ -350,7 +350,7 @@
                 <w:sz w:val="17"/>
                 <w:szCs w:val="17"/>
               </w:rPr>
-              <w:t xml:space="preserve">Green minutes = bonus.</w:t>
+              <w:t xml:space="preserve">Light stays on from the quiz.</w:t>
             </w:r>
           </w:p>
         </w:tc>
@@ -380,7 +380,7 @@
                 <w:sz w:val="18"/>
                 <w:szCs w:val="18"/>
               </w:rPr>
-              <w:t xml:space="preserve">3–15</w:t>
+              <w:t xml:space="preserve">3–8</w:t>
             </w:r>
           </w:p>
         </w:tc>
@@ -405,7 +405,7 @@
                 <w:sz w:val="18"/>
                 <w:szCs w:val="18"/>
               </w:rPr>
-              <w:t xml:space="preserve">Monster Cannon</w:t>
+              <w:t xml:space="preserve">Remember first</w:t>
             </w:r>
           </w:p>
         </w:tc>
@@ -430,7 +430,7 @@
                 <w:sz w:val="18"/>
                 <w:szCs w:val="18"/>
               </w:rPr>
-              <w:t xml:space="preserve">Read each question. Count 3–2–1: everybody shows a card. The team at the board answers and fires.</w:t>
+              <w:t xml:space="preserve">Game Maker: Remember first = On. Look and say, then cover and recall the words.</w:t>
             </w:r>
           </w:p>
         </w:tc>
@@ -455,7 +455,7 @@
                 <w:sz w:val="18"/>
                 <w:szCs w:val="18"/>
               </w:rPr>
-              <w:t xml:space="preserve">Show a card; the team answers.</w:t>
+              <w:t xml:space="preserve">Say the words; recall.</w:t>
             </w:r>
           </w:p>
         </w:tc>
@@ -480,7 +480,7 @@
                 <w:sz w:val="17"/>
                 <w:szCs w:val="17"/>
               </w:rPr>
-              <w:t xml:space="preserve">Wrong answer: a hint, try again, no minus points.</w:t>
+              <w:t xml:space="preserve">Fast; everybody speaks.</w:t>
             </w:r>
           </w:p>
         </w:tc>
@@ -510,7 +510,7 @@
                 <w:sz w:val="18"/>
                 <w:szCs w:val="18"/>
               </w:rPr>
-              <w:t xml:space="preserve">15–27</w:t>
+              <w:t xml:space="preserve">8–26</w:t>
             </w:r>
           </w:p>
         </w:tc>
@@ -535,7 +535,7 @@
                 <w:sz w:val="18"/>
                 <w:szCs w:val="18"/>
               </w:rPr>
-              <w:t xml:space="preserve">Race or Tiles</w:t>
+              <w:t xml:space="preserve">Play and write</w:t>
             </w:r>
           </w:p>
         </w:tc>
@@ -560,7 +560,7 @@
                 <w:sz w:val="18"/>
                 <w:szCs w:val="18"/>
               </w:rPr>
-              <w:t xml:space="preserve">Switch to Race (or Tiles). Same card routine.</w:t>
+              <w:t xml:space="preserve">Start Monster Cannon (Answer cards = On). Each question shows a yellow “Line N”. Read it; count 3–2–1. EVERY pupil writes on that line (word, or circle A–D after Show the answers). Then the team at the board answers and plays. Cards up: tap All / Most / Half / A few / None.</w:t>
             </w:r>
           </w:p>
         </w:tc>
@@ -585,7 +585,7 @@
                 <w:sz w:val="18"/>
                 <w:szCs w:val="18"/>
               </w:rPr>
-              <w:t xml:space="preserve">Show a card; teams take turns.</w:t>
+              <w:t xml:space="preserve">Write on the right line; hold up the paper.</w:t>
             </w:r>
           </w:p>
         </w:tc>
@@ -610,7 +610,7 @@
                 <w:sz w:val="17"/>
                 <w:szCs w:val="17"/>
               </w:rPr>
-              <w:t xml:space="preserve">Note the questions many pupils got wrong.</w:t>
+              <w:t xml:space="preserve">Nobody waits: the team plays, everybody writes. No minus points.</w:t>
             </w:r>
           </w:p>
         </w:tc>
@@ -640,7 +640,7 @@
                 <w:sz w:val="18"/>
                 <w:szCs w:val="18"/>
               </w:rPr>
-              <w:t xml:space="preserve">27–32</w:t>
+              <w:t xml:space="preserve">26–32</w:t>
             </w:r>
           </w:p>
         </w:tc>
@@ -665,7 +665,7 @@
                 <w:sz w:val="18"/>
                 <w:szCs w:val="18"/>
               </w:rPr>
-              <w:t xml:space="preserve">Memory</w:t>
+              <w:t xml:space="preserve">What we found hard</w:t>
             </w:r>
           </w:p>
         </w:tc>
@@ -690,7 +690,7 @@
                 <w:sz w:val="18"/>
                 <w:szCs w:val="18"/>
               </w:rPr>
-              <w:t xml:space="preserve">Memory game with the Units 1–4 words: teams find pairs and say the word.</w:t>
+              <w:t xml:space="preserve">At the end press 📋 What we found hard. Tap each line to show the answer; say the sentence together. Then 🧠 Practise these.</w:t>
             </w:r>
           </w:p>
         </w:tc>
@@ -715,7 +715,7 @@
                 <w:sz w:val="18"/>
                 <w:szCs w:val="18"/>
               </w:rPr>
-              <w:t xml:space="preserve">Say the word aloud.</w:t>
+              <w:t xml:space="preserve">Check their own line; correct it in another colour.</w:t>
             </w:r>
           </w:p>
         </w:tc>
@@ -740,7 +740,7 @@
                 <w:sz w:val="17"/>
                 <w:szCs w:val="17"/>
               </w:rPr>
-              <w:t xml:space="preserve">Quick and calm.</w:t>
+              <w:t xml:space="preserve">This list is also saved for Friday’s revision.</w:t>
             </w:r>
           </w:p>
         </w:tc>
@@ -795,7 +795,7 @@
                 <w:sz w:val="18"/>
                 <w:szCs w:val="18"/>
               </w:rPr>
-              <w:t xml:space="preserve">Holiday</w:t>
+              <w:t xml:space="preserve">My hard lines</w:t>
             </w:r>
           </w:p>
         </w:tc>
@@ -820,7 +820,7 @@
                 <w:sz w:val="18"/>
                 <w:szCs w:val="18"/>
               </w:rPr>
-              <w:t xml:space="preserve">Show the scores. Say: “Happy Republic Day! See you on Friday.” School ends at 12:00.</w:t>
+              <w:t xml:space="preserve">Pupils write “Hard for me: lines …” and one sentence they remember at the bottom. Collect the sheets. Happy Republic Day!</w:t>
             </w:r>
           </w:p>
         </w:tc>
@@ -845,7 +845,7 @@
                 <w:sz w:val="18"/>
                 <w:szCs w:val="18"/>
               </w:rPr>
-              <w:t xml:space="preserve">Say one word they remember.</w:t>
+              <w:t xml:space="preserve">Write and hand in.</w:t>
             </w:r>
           </w:p>
         </w:tc>
@@ -870,7 +870,7 @@
                 <w:sz w:val="17"/>
                 <w:szCs w:val="17"/>
               </w:rPr>
-              <w:t xml:space="preserve">Note 3 hard words for Revision 1 on Friday.</w:t>
+              <w:t xml:space="preserve">Look at the sheets for Friday’s Revision 1.</w:t>
             </w:r>
           </w:p>
         </w:tc>

</xml_diff>